<commit_message>
Agregación de requerimientos funcionales y no funcionales
</commit_message>
<xml_diff>
--- a/IS1_Fase1_EquipoB_Documento_Ingenieria-v0.1.docx
+++ b/IS1_Fase1_EquipoB_Documento_Ingenieria-v0.1.docx
@@ -13543,14 +13543,7 @@
                 <w:sz w:val="18"/>
                 <w:szCs w:val="18"/>
               </w:rPr>
-              <w:t>RF-0</w:t>
-            </w:r>
-            <w:r>
-              <w:rPr>
-                <w:sz w:val="18"/>
-                <w:szCs w:val="18"/>
-              </w:rPr>
-              <w:t>2.1</w:t>
+              <w:t>RF-02.1</w:t>
             </w:r>
           </w:p>
         </w:tc>
@@ -13701,14 +13694,7 @@
                 <w:sz w:val="18"/>
                 <w:szCs w:val="18"/>
               </w:rPr>
-              <w:t>RF-0</w:t>
-            </w:r>
-            <w:r>
-              <w:rPr>
-                <w:sz w:val="18"/>
-                <w:szCs w:val="18"/>
-              </w:rPr>
-              <w:t>2.2</w:t>
+              <w:t>RF-02.2</w:t>
             </w:r>
           </w:p>
         </w:tc>
@@ -13852,14 +13838,7 @@
                 <w:sz w:val="18"/>
                 <w:szCs w:val="18"/>
               </w:rPr>
-              <w:t>RF-02.</w:t>
-            </w:r>
-            <w:r>
-              <w:rPr>
-                <w:sz w:val="18"/>
-                <w:szCs w:val="18"/>
-              </w:rPr>
-              <w:t>3</w:t>
+              <w:t>RF-02.3</w:t>
             </w:r>
           </w:p>
         </w:tc>
@@ -14010,14 +13989,7 @@
                 <w:sz w:val="18"/>
                 <w:szCs w:val="18"/>
               </w:rPr>
-              <w:t>RF-0</w:t>
-            </w:r>
-            <w:r>
-              <w:rPr>
-                <w:sz w:val="18"/>
-                <w:szCs w:val="18"/>
-              </w:rPr>
-              <w:t>3.1</w:t>
+              <w:t>RF-03.1</w:t>
             </w:r>
           </w:p>
         </w:tc>
@@ -14161,14 +14133,7 @@
                 <w:sz w:val="18"/>
                 <w:szCs w:val="18"/>
               </w:rPr>
-              <w:t>RF-0</w:t>
-            </w:r>
-            <w:r>
-              <w:rPr>
-                <w:sz w:val="18"/>
-                <w:szCs w:val="18"/>
-              </w:rPr>
-              <w:t>3.2</w:t>
+              <w:t>RF-03.2</w:t>
             </w:r>
           </w:p>
         </w:tc>
@@ -14312,14 +14277,7 @@
                 <w:sz w:val="18"/>
                 <w:szCs w:val="18"/>
               </w:rPr>
-              <w:t>RF-0</w:t>
-            </w:r>
-            <w:r>
-              <w:rPr>
-                <w:sz w:val="18"/>
-                <w:szCs w:val="18"/>
-              </w:rPr>
-              <w:t>4</w:t>
+              <w:t>RF-04</w:t>
             </w:r>
           </w:p>
         </w:tc>
@@ -14479,14 +14437,7 @@
                 <w:sz w:val="18"/>
                 <w:szCs w:val="18"/>
               </w:rPr>
-              <w:t>RF-0</w:t>
-            </w:r>
-            <w:r>
-              <w:rPr>
-                <w:sz w:val="18"/>
-                <w:szCs w:val="18"/>
-              </w:rPr>
-              <w:t>5</w:t>
+              <w:t>RF-05</w:t>
             </w:r>
           </w:p>
         </w:tc>
@@ -14630,14 +14581,7 @@
                 <w:sz w:val="18"/>
                 <w:szCs w:val="18"/>
               </w:rPr>
-              <w:t>RF-0</w:t>
-            </w:r>
-            <w:r>
-              <w:rPr>
-                <w:sz w:val="18"/>
-                <w:szCs w:val="18"/>
-              </w:rPr>
-              <w:t>6</w:t>
+              <w:t>RF-06</w:t>
             </w:r>
           </w:p>
         </w:tc>
@@ -14781,14 +14725,7 @@
                 <w:sz w:val="18"/>
                 <w:szCs w:val="18"/>
               </w:rPr>
-              <w:t>RF-0</w:t>
-            </w:r>
-            <w:r>
-              <w:rPr>
-                <w:sz w:val="18"/>
-                <w:szCs w:val="18"/>
-              </w:rPr>
-              <w:t>7</w:t>
+              <w:t>RF-07</w:t>
             </w:r>
           </w:p>
         </w:tc>
@@ -14932,14 +14869,7 @@
                 <w:sz w:val="18"/>
                 <w:szCs w:val="18"/>
               </w:rPr>
-              <w:t>RF-0</w:t>
-            </w:r>
-            <w:r>
-              <w:rPr>
-                <w:sz w:val="18"/>
-                <w:szCs w:val="18"/>
-              </w:rPr>
-              <w:t>8.1</w:t>
+              <w:t>RF-08.1</w:t>
             </w:r>
           </w:p>
         </w:tc>
@@ -15083,14 +15013,7 @@
                 <w:sz w:val="18"/>
                 <w:szCs w:val="18"/>
               </w:rPr>
-              <w:t>RF-0</w:t>
-            </w:r>
-            <w:r>
-              <w:rPr>
-                <w:sz w:val="18"/>
-                <w:szCs w:val="18"/>
-              </w:rPr>
-              <w:t>8.2</w:t>
+              <w:t>RF-08.2</w:t>
             </w:r>
           </w:p>
         </w:tc>
@@ -15234,14 +15157,7 @@
                 <w:sz w:val="18"/>
                 <w:szCs w:val="18"/>
               </w:rPr>
-              <w:t>RF-0</w:t>
-            </w:r>
-            <w:r>
-              <w:rPr>
-                <w:sz w:val="18"/>
-                <w:szCs w:val="18"/>
-              </w:rPr>
-              <w:t>8.3</w:t>
+              <w:t>RF-08.3</w:t>
             </w:r>
           </w:p>
         </w:tc>
@@ -15386,14 +15302,7 @@
                 <w:szCs w:val="18"/>
               </w:rPr>
               <w:lastRenderedPageBreak/>
-              <w:t>RF-0</w:t>
-            </w:r>
-            <w:r>
-              <w:rPr>
-                <w:sz w:val="18"/>
-                <w:szCs w:val="18"/>
-              </w:rPr>
-              <w:t>9</w:t>
+              <w:t>RF-09</w:t>
             </w:r>
           </w:p>
         </w:tc>
@@ -15537,14 +15446,7 @@
                 <w:sz w:val="18"/>
                 <w:szCs w:val="18"/>
               </w:rPr>
-              <w:t>RF-</w:t>
-            </w:r>
-            <w:r>
-              <w:rPr>
-                <w:sz w:val="18"/>
-                <w:szCs w:val="18"/>
-              </w:rPr>
-              <w:t>10</w:t>
+              <w:t>RF-10</w:t>
             </w:r>
           </w:p>
         </w:tc>
@@ -17452,9 +17354,15 @@
           <w:p>
             <w:pPr>
               <w:spacing w:after="30"/>
-            </w:pPr>
-            <w:r>
-              <w:rPr>
+              <w:rPr>
+                <w:rFonts w:asciiTheme="majorHAnsi" w:hAnsiTheme="majorHAnsi" w:cstheme="majorHAnsi"/>
+                <w:sz w:val="18"/>
+                <w:szCs w:val="18"/>
+              </w:rPr>
+            </w:pPr>
+            <w:r>
+              <w:rPr>
+                <w:rFonts w:asciiTheme="majorHAnsi" w:eastAsia="Arial" w:hAnsiTheme="majorHAnsi" w:cstheme="majorHAnsi"/>
                 <w:sz w:val="18"/>
                 <w:szCs w:val="18"/>
               </w:rPr>
@@ -17481,13 +17389,37 @@
           <w:p>
             <w:pPr>
               <w:spacing w:after="30"/>
-            </w:pPr>
-            <w:r>
-              <w:rPr>
-                <w:sz w:val="18"/>
-                <w:szCs w:val="18"/>
-              </w:rPr>
-              <w:t>Eficiencia de desempeño</w:t>
+              <w:rPr>
+                <w:rFonts w:asciiTheme="majorHAnsi" w:hAnsiTheme="majorHAnsi" w:cstheme="majorHAnsi"/>
+                <w:sz w:val="18"/>
+                <w:szCs w:val="18"/>
+              </w:rPr>
+            </w:pPr>
+            <w:r>
+              <w:rPr>
+                <w:rFonts w:asciiTheme="majorHAnsi" w:eastAsia="Arial" w:hAnsiTheme="majorHAnsi" w:cstheme="majorHAnsi"/>
+                <w:sz w:val="18"/>
+                <w:szCs w:val="18"/>
+              </w:rPr>
+              <w:t>Flexibilidad (</w:t>
+            </w:r>
+            <w:proofErr w:type="spellStart"/>
+            <w:r>
+              <w:rPr>
+                <w:rFonts w:asciiTheme="majorHAnsi" w:eastAsia="Arial" w:hAnsiTheme="majorHAnsi" w:cstheme="majorHAnsi"/>
+                <w:sz w:val="18"/>
+                <w:szCs w:val="18"/>
+              </w:rPr>
+              <w:t>instalabilidad</w:t>
+            </w:r>
+            <w:proofErr w:type="spellEnd"/>
+            <w:r>
+              <w:rPr>
+                <w:rFonts w:asciiTheme="majorHAnsi" w:eastAsia="Arial" w:hAnsiTheme="majorHAnsi" w:cstheme="majorHAnsi"/>
+                <w:sz w:val="18"/>
+                <w:szCs w:val="18"/>
+              </w:rPr>
+              <w:t xml:space="preserve"> y adaptabilidad)</w:t>
             </w:r>
           </w:p>
         </w:tc>
@@ -17510,13 +17442,19 @@
           <w:p>
             <w:pPr>
               <w:spacing w:after="30"/>
-            </w:pPr>
-            <w:r>
-              <w:rPr>
-                <w:sz w:val="18"/>
-                <w:szCs w:val="18"/>
-              </w:rPr>
-              <w:t>La búsqueda de clientes…</w:t>
+              <w:rPr>
+                <w:rFonts w:asciiTheme="majorHAnsi" w:hAnsiTheme="majorHAnsi" w:cstheme="majorHAnsi"/>
+                <w:sz w:val="18"/>
+                <w:szCs w:val="18"/>
+              </w:rPr>
+            </w:pPr>
+            <w:r>
+              <w:rPr>
+                <w:rFonts w:asciiTheme="majorHAnsi" w:eastAsia="Arial" w:hAnsiTheme="majorHAnsi" w:cstheme="majorHAnsi"/>
+                <w:sz w:val="18"/>
+                <w:szCs w:val="18"/>
+              </w:rPr>
+              <w:t>El portal del cliente deberá ser una PWA responsiva que funcione en navegadores móviles iOS y Android sin instalar software ni conceder permisos especiales.</w:t>
             </w:r>
           </w:p>
         </w:tc>
@@ -17539,13 +17477,37 @@
           <w:p>
             <w:pPr>
               <w:spacing w:after="30"/>
-            </w:pPr>
-            <w:r>
-              <w:rPr>
-                <w:sz w:val="18"/>
-                <w:szCs w:val="18"/>
-              </w:rPr>
-              <w:t>Menos de 2 s con 5,000 registros</w:t>
+              <w:rPr>
+                <w:rFonts w:asciiTheme="majorHAnsi" w:hAnsiTheme="majorHAnsi" w:cstheme="majorHAnsi"/>
+                <w:sz w:val="18"/>
+                <w:szCs w:val="18"/>
+              </w:rPr>
+            </w:pPr>
+            <w:r>
+              <w:rPr>
+                <w:rFonts w:asciiTheme="majorHAnsi" w:eastAsia="Arial" w:hAnsiTheme="majorHAnsi" w:cstheme="majorHAnsi"/>
+                <w:sz w:val="18"/>
+                <w:szCs w:val="18"/>
+              </w:rPr>
+              <w:t xml:space="preserve">Funciona sin errores bloqueantes en las 2 últimas versiones de Safari (iOS) y Chrome (Android); 0 permisos solicitados al cliente; sin desplazamiento horizontal en anchos de 360 a 430 </w:t>
+            </w:r>
+            <w:proofErr w:type="spellStart"/>
+            <w:r>
+              <w:rPr>
+                <w:rFonts w:asciiTheme="majorHAnsi" w:eastAsia="Arial" w:hAnsiTheme="majorHAnsi" w:cstheme="majorHAnsi"/>
+                <w:sz w:val="18"/>
+                <w:szCs w:val="18"/>
+              </w:rPr>
+              <w:t>px</w:t>
+            </w:r>
+            <w:proofErr w:type="spellEnd"/>
+            <w:r>
+              <w:rPr>
+                <w:rFonts w:asciiTheme="majorHAnsi" w:eastAsia="Arial" w:hAnsiTheme="majorHAnsi" w:cstheme="majorHAnsi"/>
+                <w:sz w:val="18"/>
+                <w:szCs w:val="18"/>
+              </w:rPr>
+              <w:t>.</w:t>
             </w:r>
           </w:p>
         </w:tc>
@@ -17568,13 +17530,19 @@
           <w:p>
             <w:pPr>
               <w:spacing w:after="30"/>
-            </w:pPr>
-            <w:r>
-              <w:rPr>
-                <w:sz w:val="18"/>
-                <w:szCs w:val="18"/>
-              </w:rPr>
-              <w:t>Prueba de rendimiento con datos ficticios</w:t>
+              <w:rPr>
+                <w:rFonts w:asciiTheme="majorHAnsi" w:hAnsiTheme="majorHAnsi" w:cstheme="majorHAnsi"/>
+                <w:sz w:val="18"/>
+                <w:szCs w:val="18"/>
+              </w:rPr>
+            </w:pPr>
+            <w:r>
+              <w:rPr>
+                <w:rFonts w:asciiTheme="majorHAnsi" w:eastAsia="Arial" w:hAnsiTheme="majorHAnsi" w:cstheme="majorHAnsi"/>
+                <w:sz w:val="18"/>
+                <w:szCs w:val="18"/>
+              </w:rPr>
+              <w:t>Pruebas manuales en 2 móviles reales (iOS y Android) con una lista de verificación de las pantallas del cliente y revisión con las herramientas de desarrollo del navegador.</w:t>
             </w:r>
           </w:p>
         </w:tc>
@@ -17602,7 +17570,20 @@
           <w:p>
             <w:pPr>
               <w:spacing w:after="30"/>
-            </w:pPr>
+              <w:rPr>
+                <w:rFonts w:asciiTheme="majorHAnsi" w:hAnsiTheme="majorHAnsi" w:cstheme="majorHAnsi"/>
+                <w:sz w:val="18"/>
+                <w:szCs w:val="18"/>
+              </w:rPr>
+            </w:pPr>
+            <w:r>
+              <w:rPr>
+                <w:rFonts w:asciiTheme="majorHAnsi" w:eastAsia="Arial" w:hAnsiTheme="majorHAnsi" w:cstheme="majorHAnsi"/>
+                <w:sz w:val="18"/>
+                <w:szCs w:val="18"/>
+              </w:rPr>
+              <w:t>RNF-02</w:t>
+            </w:r>
           </w:p>
         </w:tc>
         <w:tc>
@@ -17624,7 +17605,20 @@
           <w:p>
             <w:pPr>
               <w:spacing w:after="30"/>
-            </w:pPr>
+              <w:rPr>
+                <w:rFonts w:asciiTheme="majorHAnsi" w:hAnsiTheme="majorHAnsi" w:cstheme="majorHAnsi"/>
+                <w:sz w:val="18"/>
+                <w:szCs w:val="18"/>
+              </w:rPr>
+            </w:pPr>
+            <w:r>
+              <w:rPr>
+                <w:rFonts w:asciiTheme="majorHAnsi" w:eastAsia="Arial" w:hAnsiTheme="majorHAnsi" w:cstheme="majorHAnsi"/>
+                <w:sz w:val="18"/>
+                <w:szCs w:val="18"/>
+              </w:rPr>
+              <w:t>Capacidad de interacción</w:t>
+            </w:r>
           </w:p>
         </w:tc>
         <w:tc>
@@ -17646,7 +17640,20 @@
           <w:p>
             <w:pPr>
               <w:spacing w:after="30"/>
-            </w:pPr>
+              <w:rPr>
+                <w:rFonts w:asciiTheme="majorHAnsi" w:hAnsiTheme="majorHAnsi" w:cstheme="majorHAnsi"/>
+                <w:sz w:val="18"/>
+                <w:szCs w:val="18"/>
+              </w:rPr>
+            </w:pPr>
+            <w:r>
+              <w:rPr>
+                <w:rFonts w:asciiTheme="majorHAnsi" w:eastAsia="Arial" w:hAnsiTheme="majorHAnsi" w:cstheme="majorHAnsi"/>
+                <w:sz w:val="18"/>
+                <w:szCs w:val="18"/>
+              </w:rPr>
+              <w:t>La interfaz de la tableta del jefe de Mecánicos deberá tener botones grandes, alto contraste y controles táctiles adaptados al uso con manos sucias y en ambiente ruidoso.</w:t>
+            </w:r>
           </w:p>
         </w:tc>
         <w:tc>
@@ -17668,7 +17675,56 @@
           <w:p>
             <w:pPr>
               <w:spacing w:after="30"/>
-            </w:pPr>
+              <w:rPr>
+                <w:rFonts w:asciiTheme="majorHAnsi" w:hAnsiTheme="majorHAnsi" w:cstheme="majorHAnsi"/>
+                <w:sz w:val="18"/>
+                <w:szCs w:val="18"/>
+              </w:rPr>
+            </w:pPr>
+            <w:r>
+              <w:rPr>
+                <w:rFonts w:asciiTheme="majorHAnsi" w:eastAsia="Arial" w:hAnsiTheme="majorHAnsi" w:cstheme="majorHAnsi"/>
+                <w:sz w:val="18"/>
+                <w:szCs w:val="18"/>
+              </w:rPr>
+              <w:t xml:space="preserve">Botones de al menos 48 × 48 </w:t>
+            </w:r>
+            <w:proofErr w:type="spellStart"/>
+            <w:r>
+              <w:rPr>
+                <w:rFonts w:asciiTheme="majorHAnsi" w:eastAsia="Arial" w:hAnsiTheme="majorHAnsi" w:cstheme="majorHAnsi"/>
+                <w:sz w:val="18"/>
+                <w:szCs w:val="18"/>
+              </w:rPr>
+              <w:t>px</w:t>
+            </w:r>
+            <w:proofErr w:type="spellEnd"/>
+            <w:r>
+              <w:rPr>
+                <w:rFonts w:asciiTheme="majorHAnsi" w:eastAsia="Arial" w:hAnsiTheme="majorHAnsi" w:cstheme="majorHAnsi"/>
+                <w:sz w:val="18"/>
+                <w:szCs w:val="18"/>
+              </w:rPr>
+              <w:t xml:space="preserve"> con separación mínima de 8 </w:t>
+            </w:r>
+            <w:proofErr w:type="spellStart"/>
+            <w:r>
+              <w:rPr>
+                <w:rFonts w:asciiTheme="majorHAnsi" w:eastAsia="Arial" w:hAnsiTheme="majorHAnsi" w:cstheme="majorHAnsi"/>
+                <w:sz w:val="18"/>
+                <w:szCs w:val="18"/>
+              </w:rPr>
+              <w:t>px</w:t>
+            </w:r>
+            <w:proofErr w:type="spellEnd"/>
+            <w:r>
+              <w:rPr>
+                <w:rFonts w:asciiTheme="majorHAnsi" w:eastAsia="Arial" w:hAnsiTheme="majorHAnsi" w:cstheme="majorHAnsi"/>
+                <w:sz w:val="18"/>
+                <w:szCs w:val="18"/>
+              </w:rPr>
+              <w:t>; contraste de texto de al menos 7:1; al menos 95 % de aciertos en 20 toques con guantes de trabajo.</w:t>
+            </w:r>
           </w:p>
         </w:tc>
         <w:tc>
@@ -17690,7 +17746,74 @@
           <w:p>
             <w:pPr>
               <w:spacing w:after="30"/>
-            </w:pPr>
+              <w:rPr>
+                <w:rFonts w:asciiTheme="majorHAnsi" w:hAnsiTheme="majorHAnsi" w:cstheme="majorHAnsi"/>
+                <w:sz w:val="18"/>
+                <w:szCs w:val="18"/>
+              </w:rPr>
+            </w:pPr>
+            <w:r>
+              <w:rPr>
+                <w:rFonts w:asciiTheme="majorHAnsi" w:eastAsia="Arial" w:hAnsiTheme="majorHAnsi" w:cstheme="majorHAnsi"/>
+                <w:sz w:val="18"/>
+                <w:szCs w:val="18"/>
+              </w:rPr>
+              <w:t xml:space="preserve">Auditoría con </w:t>
+            </w:r>
+            <w:proofErr w:type="spellStart"/>
+            <w:r>
+              <w:rPr>
+                <w:rFonts w:asciiTheme="majorHAnsi" w:eastAsia="Arial" w:hAnsiTheme="majorHAnsi" w:cstheme="majorHAnsi"/>
+                <w:sz w:val="18"/>
+                <w:szCs w:val="18"/>
+              </w:rPr>
+              <w:t>Lighthouse</w:t>
+            </w:r>
+            <w:proofErr w:type="spellEnd"/>
+            <w:r>
+              <w:rPr>
+                <w:rFonts w:asciiTheme="majorHAnsi" w:eastAsia="Arial" w:hAnsiTheme="majorHAnsi" w:cstheme="majorHAnsi"/>
+                <w:sz w:val="18"/>
+                <w:szCs w:val="18"/>
+              </w:rPr>
+              <w:t xml:space="preserve"> o </w:t>
+            </w:r>
+            <w:proofErr w:type="spellStart"/>
+            <w:r>
+              <w:rPr>
+                <w:rFonts w:asciiTheme="majorHAnsi" w:eastAsia="Arial" w:hAnsiTheme="majorHAnsi" w:cstheme="majorHAnsi"/>
+                <w:sz w:val="18"/>
+                <w:szCs w:val="18"/>
+              </w:rPr>
+              <w:t>axe</w:t>
+            </w:r>
+            <w:proofErr w:type="spellEnd"/>
+            <w:r>
+              <w:rPr>
+                <w:rFonts w:asciiTheme="majorHAnsi" w:eastAsia="Arial" w:hAnsiTheme="majorHAnsi" w:cstheme="majorHAnsi"/>
+                <w:sz w:val="18"/>
+                <w:szCs w:val="18"/>
+              </w:rPr>
+              <w:t xml:space="preserve"> </w:t>
+            </w:r>
+            <w:proofErr w:type="spellStart"/>
+            <w:r>
+              <w:rPr>
+                <w:rFonts w:asciiTheme="majorHAnsi" w:eastAsia="Arial" w:hAnsiTheme="majorHAnsi" w:cstheme="majorHAnsi"/>
+                <w:sz w:val="18"/>
+                <w:szCs w:val="18"/>
+              </w:rPr>
+              <w:t>DevTools</w:t>
+            </w:r>
+            <w:proofErr w:type="spellEnd"/>
+            <w:r>
+              <w:rPr>
+                <w:rFonts w:asciiTheme="majorHAnsi" w:eastAsia="Arial" w:hAnsiTheme="majorHAnsi" w:cstheme="majorHAnsi"/>
+                <w:sz w:val="18"/>
+                <w:szCs w:val="18"/>
+              </w:rPr>
+              <w:t xml:space="preserve"> (gratuitos), medición del contraste con un verificador y prueba en la tableta real con guantes.</w:t>
+            </w:r>
           </w:p>
         </w:tc>
       </w:tr>
@@ -17717,7 +17840,20 @@
           <w:p>
             <w:pPr>
               <w:spacing w:after="30"/>
-            </w:pPr>
+              <w:rPr>
+                <w:rFonts w:asciiTheme="majorHAnsi" w:hAnsiTheme="majorHAnsi" w:cstheme="majorHAnsi"/>
+                <w:sz w:val="18"/>
+                <w:szCs w:val="18"/>
+              </w:rPr>
+            </w:pPr>
+            <w:r>
+              <w:rPr>
+                <w:rFonts w:asciiTheme="majorHAnsi" w:eastAsia="Arial" w:hAnsiTheme="majorHAnsi" w:cstheme="majorHAnsi"/>
+                <w:sz w:val="18"/>
+                <w:szCs w:val="18"/>
+              </w:rPr>
+              <w:t>RNF-03</w:t>
+            </w:r>
           </w:p>
         </w:tc>
         <w:tc>
@@ -17739,7 +17875,20 @@
           <w:p>
             <w:pPr>
               <w:spacing w:after="30"/>
-            </w:pPr>
+              <w:rPr>
+                <w:rFonts w:asciiTheme="majorHAnsi" w:hAnsiTheme="majorHAnsi" w:cstheme="majorHAnsi"/>
+                <w:sz w:val="18"/>
+                <w:szCs w:val="18"/>
+              </w:rPr>
+            </w:pPr>
+            <w:r>
+              <w:rPr>
+                <w:rFonts w:asciiTheme="majorHAnsi" w:eastAsia="Arial" w:hAnsiTheme="majorHAnsi" w:cstheme="majorHAnsi"/>
+                <w:sz w:val="18"/>
+                <w:szCs w:val="18"/>
+              </w:rPr>
+              <w:t>Capacidad de interacción</w:t>
+            </w:r>
           </w:p>
         </w:tc>
         <w:tc>
@@ -17761,7 +17910,20 @@
           <w:p>
             <w:pPr>
               <w:spacing w:after="30"/>
-            </w:pPr>
+              <w:rPr>
+                <w:rFonts w:asciiTheme="majorHAnsi" w:hAnsiTheme="majorHAnsi" w:cstheme="majorHAnsi"/>
+                <w:sz w:val="18"/>
+                <w:szCs w:val="18"/>
+              </w:rPr>
+            </w:pPr>
+            <w:r>
+              <w:rPr>
+                <w:rFonts w:asciiTheme="majorHAnsi" w:eastAsia="Arial" w:hAnsiTheme="majorHAnsi" w:cstheme="majorHAnsi"/>
+                <w:sz w:val="18"/>
+                <w:szCs w:val="18"/>
+              </w:rPr>
+              <w:t>La interfaz de la tableta deberá ofrecer flujos de pocos pasos para las operaciones frecuentes del taller.</w:t>
+            </w:r>
           </w:p>
         </w:tc>
         <w:tc>
@@ -17783,7 +17945,20 @@
           <w:p>
             <w:pPr>
               <w:spacing w:after="30"/>
-            </w:pPr>
+              <w:rPr>
+                <w:rFonts w:asciiTheme="majorHAnsi" w:hAnsiTheme="majorHAnsi" w:cstheme="majorHAnsi"/>
+                <w:sz w:val="18"/>
+                <w:szCs w:val="18"/>
+              </w:rPr>
+            </w:pPr>
+            <w:r>
+              <w:rPr>
+                <w:rFonts w:asciiTheme="majorHAnsi" w:eastAsia="Arial" w:hAnsiTheme="majorHAnsi" w:cstheme="majorHAnsi"/>
+                <w:sz w:val="18"/>
+                <w:szCs w:val="18"/>
+              </w:rPr>
+              <w:t>Asignar bahía, actualizar el estado de una orden y sellar un trabajo en máximo 4 toques y 30 s cada una.</w:t>
+            </w:r>
           </w:p>
         </w:tc>
         <w:tc>
@@ -17805,7 +17980,1371 @@
           <w:p>
             <w:pPr>
               <w:spacing w:after="30"/>
-            </w:pPr>
+              <w:rPr>
+                <w:rFonts w:asciiTheme="majorHAnsi" w:hAnsiTheme="majorHAnsi" w:cstheme="majorHAnsi"/>
+                <w:sz w:val="18"/>
+                <w:szCs w:val="18"/>
+              </w:rPr>
+            </w:pPr>
+            <w:r>
+              <w:rPr>
+                <w:rFonts w:asciiTheme="majorHAnsi" w:eastAsia="Arial" w:hAnsiTheme="majorHAnsi" w:cstheme="majorHAnsi"/>
+                <w:sz w:val="18"/>
+                <w:szCs w:val="18"/>
+              </w:rPr>
+              <w:t>Prueba de usabilidad cronometrada con al menos 3 usuarios (o compañeros que simulen el rol), repitiendo cada operación 3 veces.</w:t>
+            </w:r>
+          </w:p>
+        </w:tc>
+      </w:tr>
+      <w:tr>
+        <w:trPr>
+          <w:cantSplit/>
+        </w:trPr>
+        <w:tc>
+          <w:tcPr>
+            <w:tcW w:w="900" w:type="dxa"/>
+            <w:tcBorders>
+              <w:top w:val="single" w:sz="4" w:space="0" w:color="A6A6A6"/>
+              <w:left w:val="single" w:sz="4" w:space="0" w:color="A6A6A6"/>
+              <w:bottom w:val="single" w:sz="4" w:space="0" w:color="A6A6A6"/>
+              <w:right w:val="single" w:sz="4" w:space="0" w:color="A6A6A6"/>
+            </w:tcBorders>
+            <w:tcMar>
+              <w:top w:w="60" w:type="dxa"/>
+              <w:left w:w="100" w:type="dxa"/>
+              <w:bottom w:w="60" w:type="dxa"/>
+              <w:right w:w="100" w:type="dxa"/>
+            </w:tcMar>
+          </w:tcPr>
+          <w:p>
+            <w:pPr>
+              <w:spacing w:after="30"/>
+              <w:rPr>
+                <w:rFonts w:asciiTheme="majorHAnsi" w:eastAsia="Arial" w:hAnsiTheme="majorHAnsi" w:cstheme="majorHAnsi"/>
+                <w:sz w:val="18"/>
+                <w:szCs w:val="18"/>
+              </w:rPr>
+            </w:pPr>
+            <w:r>
+              <w:rPr>
+                <w:rFonts w:asciiTheme="majorHAnsi" w:eastAsia="Arial" w:hAnsiTheme="majorHAnsi" w:cstheme="majorHAnsi"/>
+                <w:sz w:val="18"/>
+                <w:szCs w:val="18"/>
+              </w:rPr>
+              <w:t>RNF-04</w:t>
+            </w:r>
+          </w:p>
+        </w:tc>
+        <w:tc>
+          <w:tcPr>
+            <w:tcW w:w="2000" w:type="dxa"/>
+            <w:tcBorders>
+              <w:top w:val="single" w:sz="4" w:space="0" w:color="A6A6A6"/>
+              <w:left w:val="single" w:sz="4" w:space="0" w:color="A6A6A6"/>
+              <w:bottom w:val="single" w:sz="4" w:space="0" w:color="A6A6A6"/>
+              <w:right w:val="single" w:sz="4" w:space="0" w:color="A6A6A6"/>
+            </w:tcBorders>
+            <w:tcMar>
+              <w:top w:w="60" w:type="dxa"/>
+              <w:left w:w="100" w:type="dxa"/>
+              <w:bottom w:w="60" w:type="dxa"/>
+              <w:right w:w="100" w:type="dxa"/>
+            </w:tcMar>
+          </w:tcPr>
+          <w:p>
+            <w:pPr>
+              <w:spacing w:after="30"/>
+              <w:rPr>
+                <w:rFonts w:asciiTheme="majorHAnsi" w:eastAsia="Arial" w:hAnsiTheme="majorHAnsi" w:cstheme="majorHAnsi"/>
+                <w:sz w:val="18"/>
+                <w:szCs w:val="18"/>
+              </w:rPr>
+            </w:pPr>
+            <w:r>
+              <w:rPr>
+                <w:rFonts w:asciiTheme="majorHAnsi" w:eastAsia="Arial" w:hAnsiTheme="majorHAnsi" w:cstheme="majorHAnsi"/>
+                <w:sz w:val="18"/>
+                <w:szCs w:val="18"/>
+              </w:rPr>
+              <w:t>Seguridad (no repudio e integridad)</w:t>
+            </w:r>
+          </w:p>
+        </w:tc>
+        <w:tc>
+          <w:tcPr>
+            <w:tcW w:w="2560" w:type="dxa"/>
+            <w:tcBorders>
+              <w:top w:val="single" w:sz="4" w:space="0" w:color="A6A6A6"/>
+              <w:left w:val="single" w:sz="4" w:space="0" w:color="A6A6A6"/>
+              <w:bottom w:val="single" w:sz="4" w:space="0" w:color="A6A6A6"/>
+              <w:right w:val="single" w:sz="4" w:space="0" w:color="A6A6A6"/>
+            </w:tcBorders>
+            <w:tcMar>
+              <w:top w:w="60" w:type="dxa"/>
+              <w:left w:w="100" w:type="dxa"/>
+              <w:bottom w:w="60" w:type="dxa"/>
+              <w:right w:w="100" w:type="dxa"/>
+            </w:tcMar>
+          </w:tcPr>
+          <w:p>
+            <w:pPr>
+              <w:spacing w:after="30"/>
+              <w:rPr>
+                <w:rFonts w:asciiTheme="majorHAnsi" w:eastAsia="Arial" w:hAnsiTheme="majorHAnsi" w:cstheme="majorHAnsi"/>
+                <w:sz w:val="18"/>
+                <w:szCs w:val="18"/>
+              </w:rPr>
+            </w:pPr>
+            <w:r>
+              <w:rPr>
+                <w:rFonts w:asciiTheme="majorHAnsi" w:eastAsia="Arial" w:hAnsiTheme="majorHAnsi" w:cstheme="majorHAnsi"/>
+                <w:sz w:val="18"/>
+                <w:szCs w:val="18"/>
+              </w:rPr>
+              <w:t>Toda autorización de presupuesto o de sobrecosto mayor al 10 % deberá registrar marca de tiempo y metadatos inalterables, incluida la dirección IP, para evitar disputas con el cliente.</w:t>
+            </w:r>
+          </w:p>
+        </w:tc>
+        <w:tc>
+          <w:tcPr>
+            <w:tcW w:w="2000" w:type="dxa"/>
+            <w:tcBorders>
+              <w:top w:val="single" w:sz="4" w:space="0" w:color="A6A6A6"/>
+              <w:left w:val="single" w:sz="4" w:space="0" w:color="A6A6A6"/>
+              <w:bottom w:val="single" w:sz="4" w:space="0" w:color="A6A6A6"/>
+              <w:right w:val="single" w:sz="4" w:space="0" w:color="A6A6A6"/>
+            </w:tcBorders>
+            <w:tcMar>
+              <w:top w:w="60" w:type="dxa"/>
+              <w:left w:w="100" w:type="dxa"/>
+              <w:bottom w:w="60" w:type="dxa"/>
+              <w:right w:w="100" w:type="dxa"/>
+            </w:tcMar>
+          </w:tcPr>
+          <w:p>
+            <w:pPr>
+              <w:spacing w:after="30"/>
+              <w:rPr>
+                <w:rFonts w:asciiTheme="majorHAnsi" w:eastAsia="Arial" w:hAnsiTheme="majorHAnsi" w:cstheme="majorHAnsi"/>
+                <w:sz w:val="18"/>
+                <w:szCs w:val="18"/>
+              </w:rPr>
+            </w:pPr>
+            <w:r>
+              <w:rPr>
+                <w:rFonts w:asciiTheme="majorHAnsi" w:eastAsia="Arial" w:hAnsiTheme="majorHAnsi" w:cstheme="majorHAnsi"/>
+                <w:sz w:val="18"/>
+                <w:szCs w:val="18"/>
+              </w:rPr>
+              <w:t>100 % de las autorizaciones guardan fecha y hora UTC, IP, identificador de orden y huella SHA-256 del documento; 100 % de los intentos de alterar un registro se detectan al verificar la huella.</w:t>
+            </w:r>
+          </w:p>
+        </w:tc>
+        <w:tc>
+          <w:tcPr>
+            <w:tcW w:w="1900" w:type="dxa"/>
+            <w:tcBorders>
+              <w:top w:val="single" w:sz="4" w:space="0" w:color="A6A6A6"/>
+              <w:left w:val="single" w:sz="4" w:space="0" w:color="A6A6A6"/>
+              <w:bottom w:val="single" w:sz="4" w:space="0" w:color="A6A6A6"/>
+              <w:right w:val="single" w:sz="4" w:space="0" w:color="A6A6A6"/>
+            </w:tcBorders>
+            <w:tcMar>
+              <w:top w:w="60" w:type="dxa"/>
+              <w:left w:w="100" w:type="dxa"/>
+              <w:bottom w:w="60" w:type="dxa"/>
+              <w:right w:w="100" w:type="dxa"/>
+            </w:tcMar>
+          </w:tcPr>
+          <w:p>
+            <w:pPr>
+              <w:spacing w:after="30"/>
+              <w:rPr>
+                <w:rFonts w:asciiTheme="majorHAnsi" w:eastAsia="Arial" w:hAnsiTheme="majorHAnsi" w:cstheme="majorHAnsi"/>
+                <w:sz w:val="18"/>
+                <w:szCs w:val="18"/>
+              </w:rPr>
+            </w:pPr>
+            <w:r>
+              <w:rPr>
+                <w:rFonts w:asciiTheme="majorHAnsi" w:eastAsia="Arial" w:hAnsiTheme="majorHAnsi" w:cstheme="majorHAnsi"/>
+                <w:sz w:val="18"/>
+                <w:szCs w:val="18"/>
+              </w:rPr>
+              <w:t>Prueba con 20 autorizaciones, revisión de los registros guardados e intento de modificar directamente la base de datos para confirmar que la verificación lo detecta.</w:t>
+            </w:r>
+          </w:p>
+        </w:tc>
+      </w:tr>
+      <w:tr>
+        <w:trPr>
+          <w:cantSplit/>
+        </w:trPr>
+        <w:tc>
+          <w:tcPr>
+            <w:tcW w:w="900" w:type="dxa"/>
+            <w:tcBorders>
+              <w:top w:val="single" w:sz="4" w:space="0" w:color="A6A6A6"/>
+              <w:left w:val="single" w:sz="4" w:space="0" w:color="A6A6A6"/>
+              <w:bottom w:val="single" w:sz="4" w:space="0" w:color="A6A6A6"/>
+              <w:right w:val="single" w:sz="4" w:space="0" w:color="A6A6A6"/>
+            </w:tcBorders>
+            <w:tcMar>
+              <w:top w:w="60" w:type="dxa"/>
+              <w:left w:w="100" w:type="dxa"/>
+              <w:bottom w:w="60" w:type="dxa"/>
+              <w:right w:w="100" w:type="dxa"/>
+            </w:tcMar>
+          </w:tcPr>
+          <w:p>
+            <w:pPr>
+              <w:spacing w:after="30"/>
+              <w:rPr>
+                <w:rFonts w:asciiTheme="majorHAnsi" w:eastAsia="Arial" w:hAnsiTheme="majorHAnsi" w:cstheme="majorHAnsi"/>
+                <w:sz w:val="18"/>
+                <w:szCs w:val="18"/>
+              </w:rPr>
+            </w:pPr>
+            <w:r>
+              <w:rPr>
+                <w:rFonts w:asciiTheme="majorHAnsi" w:eastAsia="Arial" w:hAnsiTheme="majorHAnsi" w:cstheme="majorHAnsi"/>
+                <w:sz w:val="18"/>
+                <w:szCs w:val="18"/>
+              </w:rPr>
+              <w:t>RNF-05</w:t>
+            </w:r>
+          </w:p>
+        </w:tc>
+        <w:tc>
+          <w:tcPr>
+            <w:tcW w:w="2000" w:type="dxa"/>
+            <w:tcBorders>
+              <w:top w:val="single" w:sz="4" w:space="0" w:color="A6A6A6"/>
+              <w:left w:val="single" w:sz="4" w:space="0" w:color="A6A6A6"/>
+              <w:bottom w:val="single" w:sz="4" w:space="0" w:color="A6A6A6"/>
+              <w:right w:val="single" w:sz="4" w:space="0" w:color="A6A6A6"/>
+            </w:tcBorders>
+            <w:tcMar>
+              <w:top w:w="60" w:type="dxa"/>
+              <w:left w:w="100" w:type="dxa"/>
+              <w:bottom w:w="60" w:type="dxa"/>
+              <w:right w:w="100" w:type="dxa"/>
+            </w:tcMar>
+          </w:tcPr>
+          <w:p>
+            <w:pPr>
+              <w:spacing w:after="30"/>
+              <w:rPr>
+                <w:rFonts w:asciiTheme="majorHAnsi" w:eastAsia="Arial" w:hAnsiTheme="majorHAnsi" w:cstheme="majorHAnsi"/>
+                <w:sz w:val="18"/>
+                <w:szCs w:val="18"/>
+              </w:rPr>
+            </w:pPr>
+            <w:r>
+              <w:rPr>
+                <w:rFonts w:asciiTheme="majorHAnsi" w:eastAsia="Arial" w:hAnsiTheme="majorHAnsi" w:cstheme="majorHAnsi"/>
+                <w:sz w:val="18"/>
+                <w:szCs w:val="18"/>
+              </w:rPr>
+              <w:t>Seguridad (confidencialidad y cumplimiento legal)</w:t>
+            </w:r>
+          </w:p>
+        </w:tc>
+        <w:tc>
+          <w:tcPr>
+            <w:tcW w:w="2560" w:type="dxa"/>
+            <w:tcBorders>
+              <w:top w:val="single" w:sz="4" w:space="0" w:color="A6A6A6"/>
+              <w:left w:val="single" w:sz="4" w:space="0" w:color="A6A6A6"/>
+              <w:bottom w:val="single" w:sz="4" w:space="0" w:color="A6A6A6"/>
+              <w:right w:val="single" w:sz="4" w:space="0" w:color="A6A6A6"/>
+            </w:tcBorders>
+            <w:tcMar>
+              <w:top w:w="60" w:type="dxa"/>
+              <w:left w:w="100" w:type="dxa"/>
+              <w:bottom w:w="60" w:type="dxa"/>
+              <w:right w:w="100" w:type="dxa"/>
+            </w:tcMar>
+          </w:tcPr>
+          <w:p>
+            <w:pPr>
+              <w:spacing w:after="30"/>
+              <w:rPr>
+                <w:rFonts w:asciiTheme="majorHAnsi" w:eastAsia="Arial" w:hAnsiTheme="majorHAnsi" w:cstheme="majorHAnsi"/>
+                <w:sz w:val="18"/>
+                <w:szCs w:val="18"/>
+              </w:rPr>
+            </w:pPr>
+            <w:r>
+              <w:rPr>
+                <w:rFonts w:asciiTheme="majorHAnsi" w:eastAsia="Arial" w:hAnsiTheme="majorHAnsi" w:cstheme="majorHAnsi"/>
+                <w:sz w:val="18"/>
+                <w:szCs w:val="18"/>
+              </w:rPr>
+              <w:t>El manejo de datos personales deberá apegarse a la Ley Federal de Protección de Datos Personales en Posesión de los Particulares y usar solo datos ficticios en las pruebas.</w:t>
+            </w:r>
+          </w:p>
+        </w:tc>
+        <w:tc>
+          <w:tcPr>
+            <w:tcW w:w="2000" w:type="dxa"/>
+            <w:tcBorders>
+              <w:top w:val="single" w:sz="4" w:space="0" w:color="A6A6A6"/>
+              <w:left w:val="single" w:sz="4" w:space="0" w:color="A6A6A6"/>
+              <w:bottom w:val="single" w:sz="4" w:space="0" w:color="A6A6A6"/>
+              <w:right w:val="single" w:sz="4" w:space="0" w:color="A6A6A6"/>
+            </w:tcBorders>
+            <w:tcMar>
+              <w:top w:w="60" w:type="dxa"/>
+              <w:left w:w="100" w:type="dxa"/>
+              <w:bottom w:w="60" w:type="dxa"/>
+              <w:right w:w="100" w:type="dxa"/>
+            </w:tcMar>
+          </w:tcPr>
+          <w:p>
+            <w:pPr>
+              <w:spacing w:after="30"/>
+              <w:rPr>
+                <w:rFonts w:asciiTheme="majorHAnsi" w:eastAsia="Arial" w:hAnsiTheme="majorHAnsi" w:cstheme="majorHAnsi"/>
+                <w:sz w:val="18"/>
+                <w:szCs w:val="18"/>
+              </w:rPr>
+            </w:pPr>
+            <w:r>
+              <w:rPr>
+                <w:rFonts w:asciiTheme="majorHAnsi" w:eastAsia="Arial" w:hAnsiTheme="majorHAnsi" w:cstheme="majorHAnsi"/>
+                <w:sz w:val="18"/>
+                <w:szCs w:val="18"/>
+              </w:rPr>
+              <w:t>100 % de las conexiones con HTTPS (TLS 1.2 o superior); datos personales sensibles cifrados en reposo; aviso de privacidad visible en el 100 % de los formularios que capturan datos; 0 registros reales en el ambiente de pruebas.</w:t>
+            </w:r>
+          </w:p>
+        </w:tc>
+        <w:tc>
+          <w:tcPr>
+            <w:tcW w:w="1900" w:type="dxa"/>
+            <w:tcBorders>
+              <w:top w:val="single" w:sz="4" w:space="0" w:color="A6A6A6"/>
+              <w:left w:val="single" w:sz="4" w:space="0" w:color="A6A6A6"/>
+              <w:bottom w:val="single" w:sz="4" w:space="0" w:color="A6A6A6"/>
+              <w:right w:val="single" w:sz="4" w:space="0" w:color="A6A6A6"/>
+            </w:tcBorders>
+            <w:tcMar>
+              <w:top w:w="60" w:type="dxa"/>
+              <w:left w:w="100" w:type="dxa"/>
+              <w:bottom w:w="60" w:type="dxa"/>
+              <w:right w:w="100" w:type="dxa"/>
+            </w:tcMar>
+          </w:tcPr>
+          <w:p>
+            <w:pPr>
+              <w:spacing w:after="30"/>
+              <w:rPr>
+                <w:rFonts w:asciiTheme="majorHAnsi" w:eastAsia="Arial" w:hAnsiTheme="majorHAnsi" w:cstheme="majorHAnsi"/>
+                <w:sz w:val="18"/>
+                <w:szCs w:val="18"/>
+              </w:rPr>
+            </w:pPr>
+            <w:r>
+              <w:rPr>
+                <w:rFonts w:asciiTheme="majorHAnsi" w:eastAsia="Arial" w:hAnsiTheme="majorHAnsi" w:cstheme="majorHAnsi"/>
+                <w:sz w:val="18"/>
+                <w:szCs w:val="18"/>
+              </w:rPr>
+              <w:t xml:space="preserve">Análisis con testssl.sh o SSL </w:t>
+            </w:r>
+            <w:proofErr w:type="spellStart"/>
+            <w:r>
+              <w:rPr>
+                <w:rFonts w:asciiTheme="majorHAnsi" w:eastAsia="Arial" w:hAnsiTheme="majorHAnsi" w:cstheme="majorHAnsi"/>
+                <w:sz w:val="18"/>
+                <w:szCs w:val="18"/>
+              </w:rPr>
+              <w:t>Labs</w:t>
+            </w:r>
+            <w:proofErr w:type="spellEnd"/>
+            <w:r>
+              <w:rPr>
+                <w:rFonts w:asciiTheme="majorHAnsi" w:eastAsia="Arial" w:hAnsiTheme="majorHAnsi" w:cstheme="majorHAnsi"/>
+                <w:sz w:val="18"/>
+                <w:szCs w:val="18"/>
+              </w:rPr>
+              <w:t>, lista de verificación de la ley revisada por el equipo y revisión de los datos de prueba antes de cada entrega.</w:t>
+            </w:r>
+          </w:p>
+        </w:tc>
+      </w:tr>
+      <w:tr>
+        <w:trPr>
+          <w:cantSplit/>
+        </w:trPr>
+        <w:tc>
+          <w:tcPr>
+            <w:tcW w:w="900" w:type="dxa"/>
+            <w:tcBorders>
+              <w:top w:val="single" w:sz="4" w:space="0" w:color="A6A6A6"/>
+              <w:left w:val="single" w:sz="4" w:space="0" w:color="A6A6A6"/>
+              <w:bottom w:val="single" w:sz="4" w:space="0" w:color="A6A6A6"/>
+              <w:right w:val="single" w:sz="4" w:space="0" w:color="A6A6A6"/>
+            </w:tcBorders>
+            <w:tcMar>
+              <w:top w:w="60" w:type="dxa"/>
+              <w:left w:w="100" w:type="dxa"/>
+              <w:bottom w:w="60" w:type="dxa"/>
+              <w:right w:w="100" w:type="dxa"/>
+            </w:tcMar>
+          </w:tcPr>
+          <w:p>
+            <w:pPr>
+              <w:spacing w:after="30"/>
+              <w:rPr>
+                <w:rFonts w:asciiTheme="majorHAnsi" w:eastAsia="Arial" w:hAnsiTheme="majorHAnsi" w:cstheme="majorHAnsi"/>
+                <w:sz w:val="18"/>
+                <w:szCs w:val="18"/>
+              </w:rPr>
+            </w:pPr>
+            <w:r>
+              <w:rPr>
+                <w:rFonts w:asciiTheme="majorHAnsi" w:eastAsia="Arial" w:hAnsiTheme="majorHAnsi" w:cstheme="majorHAnsi"/>
+                <w:sz w:val="18"/>
+                <w:szCs w:val="18"/>
+              </w:rPr>
+              <w:t>RNF-06</w:t>
+            </w:r>
+          </w:p>
+        </w:tc>
+        <w:tc>
+          <w:tcPr>
+            <w:tcW w:w="2000" w:type="dxa"/>
+            <w:tcBorders>
+              <w:top w:val="single" w:sz="4" w:space="0" w:color="A6A6A6"/>
+              <w:left w:val="single" w:sz="4" w:space="0" w:color="A6A6A6"/>
+              <w:bottom w:val="single" w:sz="4" w:space="0" w:color="A6A6A6"/>
+              <w:right w:val="single" w:sz="4" w:space="0" w:color="A6A6A6"/>
+            </w:tcBorders>
+            <w:tcMar>
+              <w:top w:w="60" w:type="dxa"/>
+              <w:left w:w="100" w:type="dxa"/>
+              <w:bottom w:w="60" w:type="dxa"/>
+              <w:right w:w="100" w:type="dxa"/>
+            </w:tcMar>
+          </w:tcPr>
+          <w:p>
+            <w:pPr>
+              <w:spacing w:after="30"/>
+              <w:rPr>
+                <w:rFonts w:asciiTheme="majorHAnsi" w:eastAsia="Arial" w:hAnsiTheme="majorHAnsi" w:cstheme="majorHAnsi"/>
+                <w:sz w:val="18"/>
+                <w:szCs w:val="18"/>
+              </w:rPr>
+            </w:pPr>
+            <w:r>
+              <w:rPr>
+                <w:rFonts w:asciiTheme="majorHAnsi" w:eastAsia="Arial" w:hAnsiTheme="majorHAnsi" w:cstheme="majorHAnsi"/>
+                <w:sz w:val="18"/>
+                <w:szCs w:val="18"/>
+              </w:rPr>
+              <w:t>Eficiencia de desempeño</w:t>
+            </w:r>
+          </w:p>
+        </w:tc>
+        <w:tc>
+          <w:tcPr>
+            <w:tcW w:w="2560" w:type="dxa"/>
+            <w:tcBorders>
+              <w:top w:val="single" w:sz="4" w:space="0" w:color="A6A6A6"/>
+              <w:left w:val="single" w:sz="4" w:space="0" w:color="A6A6A6"/>
+              <w:bottom w:val="single" w:sz="4" w:space="0" w:color="A6A6A6"/>
+              <w:right w:val="single" w:sz="4" w:space="0" w:color="A6A6A6"/>
+            </w:tcBorders>
+            <w:tcMar>
+              <w:top w:w="60" w:type="dxa"/>
+              <w:left w:w="100" w:type="dxa"/>
+              <w:bottom w:w="60" w:type="dxa"/>
+              <w:right w:w="100" w:type="dxa"/>
+            </w:tcMar>
+          </w:tcPr>
+          <w:p>
+            <w:pPr>
+              <w:spacing w:after="30"/>
+              <w:rPr>
+                <w:rFonts w:asciiTheme="majorHAnsi" w:eastAsia="Arial" w:hAnsiTheme="majorHAnsi" w:cstheme="majorHAnsi"/>
+                <w:sz w:val="18"/>
+                <w:szCs w:val="18"/>
+              </w:rPr>
+            </w:pPr>
+            <w:r>
+              <w:rPr>
+                <w:rFonts w:asciiTheme="majorHAnsi" w:eastAsia="Arial" w:hAnsiTheme="majorHAnsi" w:cstheme="majorHAnsi"/>
+                <w:sz w:val="18"/>
+                <w:szCs w:val="18"/>
+              </w:rPr>
+              <w:t>El registro de recepción se deberá guardar de forma local con rapidez, aun sin conexión.</w:t>
+            </w:r>
+          </w:p>
+        </w:tc>
+        <w:tc>
+          <w:tcPr>
+            <w:tcW w:w="2000" w:type="dxa"/>
+            <w:tcBorders>
+              <w:top w:val="single" w:sz="4" w:space="0" w:color="A6A6A6"/>
+              <w:left w:val="single" w:sz="4" w:space="0" w:color="A6A6A6"/>
+              <w:bottom w:val="single" w:sz="4" w:space="0" w:color="A6A6A6"/>
+              <w:right w:val="single" w:sz="4" w:space="0" w:color="A6A6A6"/>
+            </w:tcBorders>
+            <w:tcMar>
+              <w:top w:w="60" w:type="dxa"/>
+              <w:left w:w="100" w:type="dxa"/>
+              <w:bottom w:w="60" w:type="dxa"/>
+              <w:right w:w="100" w:type="dxa"/>
+            </w:tcMar>
+          </w:tcPr>
+          <w:p>
+            <w:pPr>
+              <w:spacing w:after="30"/>
+              <w:rPr>
+                <w:rFonts w:asciiTheme="majorHAnsi" w:eastAsia="Arial" w:hAnsiTheme="majorHAnsi" w:cstheme="majorHAnsi"/>
+                <w:sz w:val="18"/>
+                <w:szCs w:val="18"/>
+              </w:rPr>
+            </w:pPr>
+            <w:r>
+              <w:rPr>
+                <w:rFonts w:asciiTheme="majorHAnsi" w:eastAsia="Arial" w:hAnsiTheme="majorHAnsi" w:cstheme="majorHAnsi"/>
+                <w:sz w:val="18"/>
+                <w:szCs w:val="18"/>
+              </w:rPr>
+              <w:t>Guardar un registro con 5 fotografías en máximo 2 s (percentil 95) en la tableta o laptop del taller.</w:t>
+            </w:r>
+          </w:p>
+        </w:tc>
+        <w:tc>
+          <w:tcPr>
+            <w:tcW w:w="1900" w:type="dxa"/>
+            <w:tcBorders>
+              <w:top w:val="single" w:sz="4" w:space="0" w:color="A6A6A6"/>
+              <w:left w:val="single" w:sz="4" w:space="0" w:color="A6A6A6"/>
+              <w:bottom w:val="single" w:sz="4" w:space="0" w:color="A6A6A6"/>
+              <w:right w:val="single" w:sz="4" w:space="0" w:color="A6A6A6"/>
+            </w:tcBorders>
+            <w:tcMar>
+              <w:top w:w="60" w:type="dxa"/>
+              <w:left w:w="100" w:type="dxa"/>
+              <w:bottom w:w="60" w:type="dxa"/>
+              <w:right w:w="100" w:type="dxa"/>
+            </w:tcMar>
+          </w:tcPr>
+          <w:p>
+            <w:pPr>
+              <w:spacing w:after="30"/>
+              <w:rPr>
+                <w:rFonts w:asciiTheme="majorHAnsi" w:eastAsia="Arial" w:hAnsiTheme="majorHAnsi" w:cstheme="majorHAnsi"/>
+                <w:sz w:val="18"/>
+                <w:szCs w:val="18"/>
+              </w:rPr>
+            </w:pPr>
+            <w:r>
+              <w:rPr>
+                <w:rFonts w:asciiTheme="majorHAnsi" w:eastAsia="Arial" w:hAnsiTheme="majorHAnsi" w:cstheme="majorHAnsi"/>
+                <w:sz w:val="18"/>
+                <w:szCs w:val="18"/>
+              </w:rPr>
+              <w:t>20 repeticiones cronometradas con la herramienta de rendimiento del navegador, calculando el percentil 95.</w:t>
+            </w:r>
+          </w:p>
+        </w:tc>
+      </w:tr>
+      <w:tr>
+        <w:trPr>
+          <w:cantSplit/>
+        </w:trPr>
+        <w:tc>
+          <w:tcPr>
+            <w:tcW w:w="900" w:type="dxa"/>
+            <w:tcBorders>
+              <w:top w:val="single" w:sz="4" w:space="0" w:color="A6A6A6"/>
+              <w:left w:val="single" w:sz="4" w:space="0" w:color="A6A6A6"/>
+              <w:bottom w:val="single" w:sz="4" w:space="0" w:color="A6A6A6"/>
+              <w:right w:val="single" w:sz="4" w:space="0" w:color="A6A6A6"/>
+            </w:tcBorders>
+            <w:tcMar>
+              <w:top w:w="60" w:type="dxa"/>
+              <w:left w:w="100" w:type="dxa"/>
+              <w:bottom w:w="60" w:type="dxa"/>
+              <w:right w:w="100" w:type="dxa"/>
+            </w:tcMar>
+          </w:tcPr>
+          <w:p>
+            <w:pPr>
+              <w:spacing w:after="30"/>
+              <w:rPr>
+                <w:rFonts w:asciiTheme="majorHAnsi" w:eastAsia="Arial" w:hAnsiTheme="majorHAnsi" w:cstheme="majorHAnsi"/>
+                <w:sz w:val="18"/>
+                <w:szCs w:val="18"/>
+              </w:rPr>
+            </w:pPr>
+            <w:r>
+              <w:rPr>
+                <w:rFonts w:asciiTheme="majorHAnsi" w:eastAsia="Arial" w:hAnsiTheme="majorHAnsi" w:cstheme="majorHAnsi"/>
+                <w:sz w:val="18"/>
+                <w:szCs w:val="18"/>
+              </w:rPr>
+              <w:lastRenderedPageBreak/>
+              <w:t>RNF-07</w:t>
+            </w:r>
+          </w:p>
+        </w:tc>
+        <w:tc>
+          <w:tcPr>
+            <w:tcW w:w="2000" w:type="dxa"/>
+            <w:tcBorders>
+              <w:top w:val="single" w:sz="4" w:space="0" w:color="A6A6A6"/>
+              <w:left w:val="single" w:sz="4" w:space="0" w:color="A6A6A6"/>
+              <w:bottom w:val="single" w:sz="4" w:space="0" w:color="A6A6A6"/>
+              <w:right w:val="single" w:sz="4" w:space="0" w:color="A6A6A6"/>
+            </w:tcBorders>
+            <w:tcMar>
+              <w:top w:w="60" w:type="dxa"/>
+              <w:left w:w="100" w:type="dxa"/>
+              <w:bottom w:w="60" w:type="dxa"/>
+              <w:right w:w="100" w:type="dxa"/>
+            </w:tcMar>
+          </w:tcPr>
+          <w:p>
+            <w:pPr>
+              <w:spacing w:after="30"/>
+              <w:rPr>
+                <w:rFonts w:asciiTheme="majorHAnsi" w:eastAsia="Arial" w:hAnsiTheme="majorHAnsi" w:cstheme="majorHAnsi"/>
+                <w:sz w:val="18"/>
+                <w:szCs w:val="18"/>
+              </w:rPr>
+            </w:pPr>
+            <w:r>
+              <w:rPr>
+                <w:rFonts w:asciiTheme="majorHAnsi" w:eastAsia="Arial" w:hAnsiTheme="majorHAnsi" w:cstheme="majorHAnsi"/>
+                <w:sz w:val="18"/>
+                <w:szCs w:val="18"/>
+              </w:rPr>
+              <w:t>Mantenibilidad (modificabilidad)</w:t>
+            </w:r>
+          </w:p>
+        </w:tc>
+        <w:tc>
+          <w:tcPr>
+            <w:tcW w:w="2560" w:type="dxa"/>
+            <w:tcBorders>
+              <w:top w:val="single" w:sz="4" w:space="0" w:color="A6A6A6"/>
+              <w:left w:val="single" w:sz="4" w:space="0" w:color="A6A6A6"/>
+              <w:bottom w:val="single" w:sz="4" w:space="0" w:color="A6A6A6"/>
+              <w:right w:val="single" w:sz="4" w:space="0" w:color="A6A6A6"/>
+            </w:tcBorders>
+            <w:tcMar>
+              <w:top w:w="60" w:type="dxa"/>
+              <w:left w:w="100" w:type="dxa"/>
+              <w:bottom w:w="60" w:type="dxa"/>
+              <w:right w:w="100" w:type="dxa"/>
+            </w:tcMar>
+          </w:tcPr>
+          <w:p>
+            <w:pPr>
+              <w:spacing w:after="30"/>
+              <w:rPr>
+                <w:rFonts w:asciiTheme="majorHAnsi" w:eastAsia="Arial" w:hAnsiTheme="majorHAnsi" w:cstheme="majorHAnsi"/>
+                <w:sz w:val="18"/>
+                <w:szCs w:val="18"/>
+              </w:rPr>
+            </w:pPr>
+            <w:r>
+              <w:rPr>
+                <w:rFonts w:asciiTheme="majorHAnsi" w:eastAsia="Arial" w:hAnsiTheme="majorHAnsi" w:cstheme="majorHAnsi"/>
+                <w:sz w:val="18"/>
+                <w:szCs w:val="18"/>
+              </w:rPr>
+              <w:t xml:space="preserve">El desarrollo deberá usar únicamente herramientas de código abierto, </w:t>
+            </w:r>
+            <w:proofErr w:type="spellStart"/>
+            <w:r>
+              <w:rPr>
+                <w:rFonts w:asciiTheme="majorHAnsi" w:eastAsia="Arial" w:hAnsiTheme="majorHAnsi" w:cstheme="majorHAnsi"/>
+                <w:sz w:val="18"/>
+                <w:szCs w:val="18"/>
+              </w:rPr>
+              <w:t>frameworks</w:t>
+            </w:r>
+            <w:proofErr w:type="spellEnd"/>
+            <w:r>
+              <w:rPr>
+                <w:rFonts w:asciiTheme="majorHAnsi" w:eastAsia="Arial" w:hAnsiTheme="majorHAnsi" w:cstheme="majorHAnsi"/>
+                <w:sz w:val="18"/>
+                <w:szCs w:val="18"/>
+              </w:rPr>
+              <w:t xml:space="preserve"> de uso libre (como </w:t>
+            </w:r>
+            <w:proofErr w:type="spellStart"/>
+            <w:r>
+              <w:rPr>
+                <w:rFonts w:asciiTheme="majorHAnsi" w:eastAsia="Arial" w:hAnsiTheme="majorHAnsi" w:cstheme="majorHAnsi"/>
+                <w:sz w:val="18"/>
+                <w:szCs w:val="18"/>
+              </w:rPr>
+              <w:t>FastAPI</w:t>
+            </w:r>
+            <w:proofErr w:type="spellEnd"/>
+            <w:r>
+              <w:rPr>
+                <w:rFonts w:asciiTheme="majorHAnsi" w:eastAsia="Arial" w:hAnsiTheme="majorHAnsi" w:cstheme="majorHAnsi"/>
+                <w:sz w:val="18"/>
+                <w:szCs w:val="18"/>
+              </w:rPr>
+              <w:t xml:space="preserve"> y Python) y planes educativos.</w:t>
+            </w:r>
+          </w:p>
+        </w:tc>
+        <w:tc>
+          <w:tcPr>
+            <w:tcW w:w="2000" w:type="dxa"/>
+            <w:tcBorders>
+              <w:top w:val="single" w:sz="4" w:space="0" w:color="A6A6A6"/>
+              <w:left w:val="single" w:sz="4" w:space="0" w:color="A6A6A6"/>
+              <w:bottom w:val="single" w:sz="4" w:space="0" w:color="A6A6A6"/>
+              <w:right w:val="single" w:sz="4" w:space="0" w:color="A6A6A6"/>
+            </w:tcBorders>
+            <w:tcMar>
+              <w:top w:w="60" w:type="dxa"/>
+              <w:left w:w="100" w:type="dxa"/>
+              <w:bottom w:w="60" w:type="dxa"/>
+              <w:right w:w="100" w:type="dxa"/>
+            </w:tcMar>
+          </w:tcPr>
+          <w:p>
+            <w:pPr>
+              <w:spacing w:after="30"/>
+              <w:rPr>
+                <w:rFonts w:asciiTheme="majorHAnsi" w:eastAsia="Arial" w:hAnsiTheme="majorHAnsi" w:cstheme="majorHAnsi"/>
+                <w:sz w:val="18"/>
+                <w:szCs w:val="18"/>
+              </w:rPr>
+            </w:pPr>
+            <w:r>
+              <w:rPr>
+                <w:rFonts w:asciiTheme="majorHAnsi" w:eastAsia="Arial" w:hAnsiTheme="majorHAnsi" w:cstheme="majorHAnsi"/>
+                <w:sz w:val="18"/>
+                <w:szCs w:val="18"/>
+              </w:rPr>
+              <w:t>100 % de las dependencias con licencia de código abierto o plan educativo vigente; costo de licenciamiento de $0 en esta fase.</w:t>
+            </w:r>
+          </w:p>
+        </w:tc>
+        <w:tc>
+          <w:tcPr>
+            <w:tcW w:w="1900" w:type="dxa"/>
+            <w:tcBorders>
+              <w:top w:val="single" w:sz="4" w:space="0" w:color="A6A6A6"/>
+              <w:left w:val="single" w:sz="4" w:space="0" w:color="A6A6A6"/>
+              <w:bottom w:val="single" w:sz="4" w:space="0" w:color="A6A6A6"/>
+              <w:right w:val="single" w:sz="4" w:space="0" w:color="A6A6A6"/>
+            </w:tcBorders>
+            <w:tcMar>
+              <w:top w:w="60" w:type="dxa"/>
+              <w:left w:w="100" w:type="dxa"/>
+              <w:bottom w:w="60" w:type="dxa"/>
+              <w:right w:w="100" w:type="dxa"/>
+            </w:tcMar>
+          </w:tcPr>
+          <w:p>
+            <w:pPr>
+              <w:spacing w:after="30"/>
+              <w:rPr>
+                <w:rFonts w:asciiTheme="majorHAnsi" w:eastAsia="Arial" w:hAnsiTheme="majorHAnsi" w:cstheme="majorHAnsi"/>
+                <w:sz w:val="18"/>
+                <w:szCs w:val="18"/>
+              </w:rPr>
+            </w:pPr>
+            <w:r>
+              <w:rPr>
+                <w:rFonts w:asciiTheme="majorHAnsi" w:eastAsia="Arial" w:hAnsiTheme="majorHAnsi" w:cstheme="majorHAnsi"/>
+                <w:sz w:val="18"/>
+                <w:szCs w:val="18"/>
+              </w:rPr>
+              <w:t xml:space="preserve">Inventario de dependencias con herramientas de revisión de licencias (por ejemplo, </w:t>
+            </w:r>
+            <w:proofErr w:type="spellStart"/>
+            <w:r>
+              <w:rPr>
+                <w:rFonts w:asciiTheme="majorHAnsi" w:eastAsia="Arial" w:hAnsiTheme="majorHAnsi" w:cstheme="majorHAnsi"/>
+                <w:sz w:val="18"/>
+                <w:szCs w:val="18"/>
+              </w:rPr>
+              <w:t>pip-licenses</w:t>
+            </w:r>
+            <w:proofErr w:type="spellEnd"/>
+            <w:r>
+              <w:rPr>
+                <w:rFonts w:asciiTheme="majorHAnsi" w:eastAsia="Arial" w:hAnsiTheme="majorHAnsi" w:cstheme="majorHAnsi"/>
+                <w:sz w:val="18"/>
+                <w:szCs w:val="18"/>
+              </w:rPr>
+              <w:t>) y registro de los planes educativos usados.</w:t>
+            </w:r>
+          </w:p>
+        </w:tc>
+      </w:tr>
+      <w:tr>
+        <w:trPr>
+          <w:cantSplit/>
+        </w:trPr>
+        <w:tc>
+          <w:tcPr>
+            <w:tcW w:w="900" w:type="dxa"/>
+            <w:tcBorders>
+              <w:top w:val="single" w:sz="4" w:space="0" w:color="A6A6A6"/>
+              <w:left w:val="single" w:sz="4" w:space="0" w:color="A6A6A6"/>
+              <w:bottom w:val="single" w:sz="4" w:space="0" w:color="A6A6A6"/>
+              <w:right w:val="single" w:sz="4" w:space="0" w:color="A6A6A6"/>
+            </w:tcBorders>
+            <w:tcMar>
+              <w:top w:w="60" w:type="dxa"/>
+              <w:left w:w="100" w:type="dxa"/>
+              <w:bottom w:w="60" w:type="dxa"/>
+              <w:right w:w="100" w:type="dxa"/>
+            </w:tcMar>
+          </w:tcPr>
+          <w:p>
+            <w:pPr>
+              <w:spacing w:after="30"/>
+              <w:rPr>
+                <w:rFonts w:asciiTheme="majorHAnsi" w:eastAsia="Arial" w:hAnsiTheme="majorHAnsi" w:cstheme="majorHAnsi"/>
+                <w:sz w:val="18"/>
+                <w:szCs w:val="18"/>
+              </w:rPr>
+            </w:pPr>
+            <w:r>
+              <w:rPr>
+                <w:rFonts w:asciiTheme="majorHAnsi" w:eastAsia="Arial" w:hAnsiTheme="majorHAnsi" w:cstheme="majorHAnsi"/>
+                <w:sz w:val="18"/>
+                <w:szCs w:val="18"/>
+              </w:rPr>
+              <w:t>RNF-08</w:t>
+            </w:r>
+          </w:p>
+        </w:tc>
+        <w:tc>
+          <w:tcPr>
+            <w:tcW w:w="2000" w:type="dxa"/>
+            <w:tcBorders>
+              <w:top w:val="single" w:sz="4" w:space="0" w:color="A6A6A6"/>
+              <w:left w:val="single" w:sz="4" w:space="0" w:color="A6A6A6"/>
+              <w:bottom w:val="single" w:sz="4" w:space="0" w:color="A6A6A6"/>
+              <w:right w:val="single" w:sz="4" w:space="0" w:color="A6A6A6"/>
+            </w:tcBorders>
+            <w:tcMar>
+              <w:top w:w="60" w:type="dxa"/>
+              <w:left w:w="100" w:type="dxa"/>
+              <w:bottom w:w="60" w:type="dxa"/>
+              <w:right w:w="100" w:type="dxa"/>
+            </w:tcMar>
+          </w:tcPr>
+          <w:p>
+            <w:pPr>
+              <w:spacing w:after="30"/>
+              <w:rPr>
+                <w:rFonts w:asciiTheme="majorHAnsi" w:eastAsia="Arial" w:hAnsiTheme="majorHAnsi" w:cstheme="majorHAnsi"/>
+                <w:sz w:val="18"/>
+                <w:szCs w:val="18"/>
+              </w:rPr>
+            </w:pPr>
+            <w:r>
+              <w:rPr>
+                <w:rFonts w:asciiTheme="majorHAnsi" w:eastAsia="Arial" w:hAnsiTheme="majorHAnsi" w:cstheme="majorHAnsi"/>
+                <w:sz w:val="18"/>
+                <w:szCs w:val="18"/>
+              </w:rPr>
+              <w:t>Fiabilidad (tolerancia a fallos)</w:t>
+            </w:r>
+          </w:p>
+        </w:tc>
+        <w:tc>
+          <w:tcPr>
+            <w:tcW w:w="2560" w:type="dxa"/>
+            <w:tcBorders>
+              <w:top w:val="single" w:sz="4" w:space="0" w:color="A6A6A6"/>
+              <w:left w:val="single" w:sz="4" w:space="0" w:color="A6A6A6"/>
+              <w:bottom w:val="single" w:sz="4" w:space="0" w:color="A6A6A6"/>
+              <w:right w:val="single" w:sz="4" w:space="0" w:color="A6A6A6"/>
+            </w:tcBorders>
+            <w:tcMar>
+              <w:top w:w="60" w:type="dxa"/>
+              <w:left w:w="100" w:type="dxa"/>
+              <w:bottom w:w="60" w:type="dxa"/>
+              <w:right w:w="100" w:type="dxa"/>
+            </w:tcMar>
+          </w:tcPr>
+          <w:p>
+            <w:pPr>
+              <w:spacing w:after="30"/>
+              <w:rPr>
+                <w:rFonts w:asciiTheme="majorHAnsi" w:eastAsia="Arial" w:hAnsiTheme="majorHAnsi" w:cstheme="majorHAnsi"/>
+                <w:sz w:val="18"/>
+                <w:szCs w:val="18"/>
+              </w:rPr>
+            </w:pPr>
+            <w:r>
+              <w:rPr>
+                <w:rFonts w:asciiTheme="majorHAnsi" w:eastAsia="Arial" w:hAnsiTheme="majorHAnsi" w:cstheme="majorHAnsi"/>
+                <w:sz w:val="18"/>
+                <w:szCs w:val="18"/>
+              </w:rPr>
+              <w:t>El personal interno deberá poder operar sin internet o sin energía eléctrica, con equipos en batería, bajo una arquitectura local con sincronización diferida.</w:t>
+            </w:r>
+          </w:p>
+        </w:tc>
+        <w:tc>
+          <w:tcPr>
+            <w:tcW w:w="2000" w:type="dxa"/>
+            <w:tcBorders>
+              <w:top w:val="single" w:sz="4" w:space="0" w:color="A6A6A6"/>
+              <w:left w:val="single" w:sz="4" w:space="0" w:color="A6A6A6"/>
+              <w:bottom w:val="single" w:sz="4" w:space="0" w:color="A6A6A6"/>
+              <w:right w:val="single" w:sz="4" w:space="0" w:color="A6A6A6"/>
+            </w:tcBorders>
+            <w:tcMar>
+              <w:top w:w="60" w:type="dxa"/>
+              <w:left w:w="100" w:type="dxa"/>
+              <w:bottom w:w="60" w:type="dxa"/>
+              <w:right w:w="100" w:type="dxa"/>
+            </w:tcMar>
+          </w:tcPr>
+          <w:p>
+            <w:pPr>
+              <w:spacing w:after="30"/>
+              <w:rPr>
+                <w:rFonts w:asciiTheme="majorHAnsi" w:eastAsia="Arial" w:hAnsiTheme="majorHAnsi" w:cstheme="majorHAnsi"/>
+                <w:sz w:val="18"/>
+                <w:szCs w:val="18"/>
+              </w:rPr>
+            </w:pPr>
+            <w:r>
+              <w:rPr>
+                <w:rFonts w:asciiTheme="majorHAnsi" w:eastAsia="Arial" w:hAnsiTheme="majorHAnsi" w:cstheme="majorHAnsi"/>
+                <w:sz w:val="18"/>
+                <w:szCs w:val="18"/>
+              </w:rPr>
+              <w:t xml:space="preserve">Las 7 operaciones definidas (registro de entrada, </w:t>
+            </w:r>
+            <w:proofErr w:type="spellStart"/>
+            <w:r>
+              <w:rPr>
+                <w:rFonts w:asciiTheme="majorHAnsi" w:eastAsia="Arial" w:hAnsiTheme="majorHAnsi" w:cstheme="majorHAnsi"/>
+                <w:sz w:val="18"/>
+                <w:szCs w:val="18"/>
+              </w:rPr>
+              <w:t>checklist</w:t>
+            </w:r>
+            <w:proofErr w:type="spellEnd"/>
+            <w:r>
+              <w:rPr>
+                <w:rFonts w:asciiTheme="majorHAnsi" w:eastAsia="Arial" w:hAnsiTheme="majorHAnsi" w:cstheme="majorHAnsi"/>
+                <w:sz w:val="18"/>
+                <w:szCs w:val="18"/>
+              </w:rPr>
+              <w:t>, fotografías, diagnósticos, asignación de bahías, consulta de proveedores y autorizaciones gerenciales) funcionan al 100 % durante al menos 4 h sin conexión; 0 datos perdidos.</w:t>
+            </w:r>
+          </w:p>
+        </w:tc>
+        <w:tc>
+          <w:tcPr>
+            <w:tcW w:w="1900" w:type="dxa"/>
+            <w:tcBorders>
+              <w:top w:val="single" w:sz="4" w:space="0" w:color="A6A6A6"/>
+              <w:left w:val="single" w:sz="4" w:space="0" w:color="A6A6A6"/>
+              <w:bottom w:val="single" w:sz="4" w:space="0" w:color="A6A6A6"/>
+              <w:right w:val="single" w:sz="4" w:space="0" w:color="A6A6A6"/>
+            </w:tcBorders>
+            <w:tcMar>
+              <w:top w:w="60" w:type="dxa"/>
+              <w:left w:w="100" w:type="dxa"/>
+              <w:bottom w:w="60" w:type="dxa"/>
+              <w:right w:w="100" w:type="dxa"/>
+            </w:tcMar>
+          </w:tcPr>
+          <w:p>
+            <w:pPr>
+              <w:spacing w:after="30"/>
+              <w:rPr>
+                <w:rFonts w:asciiTheme="majorHAnsi" w:eastAsia="Arial" w:hAnsiTheme="majorHAnsi" w:cstheme="majorHAnsi"/>
+                <w:sz w:val="18"/>
+                <w:szCs w:val="18"/>
+              </w:rPr>
+            </w:pPr>
+            <w:r>
+              <w:rPr>
+                <w:rFonts w:asciiTheme="majorHAnsi" w:eastAsia="Arial" w:hAnsiTheme="majorHAnsi" w:cstheme="majorHAnsi"/>
+                <w:sz w:val="18"/>
+                <w:szCs w:val="18"/>
+              </w:rPr>
+              <w:t>Casos de prueba de las 7 operaciones con la red desconectada y un equipo con batería, comparando los registros al terminar.</w:t>
+            </w:r>
+          </w:p>
+        </w:tc>
+      </w:tr>
+      <w:tr>
+        <w:trPr>
+          <w:cantSplit/>
+        </w:trPr>
+        <w:tc>
+          <w:tcPr>
+            <w:tcW w:w="900" w:type="dxa"/>
+            <w:tcBorders>
+              <w:top w:val="single" w:sz="4" w:space="0" w:color="A6A6A6"/>
+              <w:left w:val="single" w:sz="4" w:space="0" w:color="A6A6A6"/>
+              <w:bottom w:val="single" w:sz="4" w:space="0" w:color="A6A6A6"/>
+              <w:right w:val="single" w:sz="4" w:space="0" w:color="A6A6A6"/>
+            </w:tcBorders>
+            <w:tcMar>
+              <w:top w:w="60" w:type="dxa"/>
+              <w:left w:w="100" w:type="dxa"/>
+              <w:bottom w:w="60" w:type="dxa"/>
+              <w:right w:w="100" w:type="dxa"/>
+            </w:tcMar>
+          </w:tcPr>
+          <w:p>
+            <w:pPr>
+              <w:spacing w:after="30"/>
+              <w:rPr>
+                <w:rFonts w:asciiTheme="majorHAnsi" w:eastAsia="Arial" w:hAnsiTheme="majorHAnsi" w:cstheme="majorHAnsi"/>
+                <w:sz w:val="18"/>
+                <w:szCs w:val="18"/>
+              </w:rPr>
+            </w:pPr>
+            <w:r>
+              <w:rPr>
+                <w:rFonts w:asciiTheme="majorHAnsi" w:eastAsia="Arial" w:hAnsiTheme="majorHAnsi" w:cstheme="majorHAnsi"/>
+                <w:sz w:val="18"/>
+                <w:szCs w:val="18"/>
+              </w:rPr>
+              <w:t>RNF-09</w:t>
+            </w:r>
+          </w:p>
+        </w:tc>
+        <w:tc>
+          <w:tcPr>
+            <w:tcW w:w="2000" w:type="dxa"/>
+            <w:tcBorders>
+              <w:top w:val="single" w:sz="4" w:space="0" w:color="A6A6A6"/>
+              <w:left w:val="single" w:sz="4" w:space="0" w:color="A6A6A6"/>
+              <w:bottom w:val="single" w:sz="4" w:space="0" w:color="A6A6A6"/>
+              <w:right w:val="single" w:sz="4" w:space="0" w:color="A6A6A6"/>
+            </w:tcBorders>
+            <w:tcMar>
+              <w:top w:w="60" w:type="dxa"/>
+              <w:left w:w="100" w:type="dxa"/>
+              <w:bottom w:w="60" w:type="dxa"/>
+              <w:right w:w="100" w:type="dxa"/>
+            </w:tcMar>
+          </w:tcPr>
+          <w:p>
+            <w:pPr>
+              <w:spacing w:after="30"/>
+              <w:rPr>
+                <w:rFonts w:asciiTheme="majorHAnsi" w:eastAsia="Arial" w:hAnsiTheme="majorHAnsi" w:cstheme="majorHAnsi"/>
+                <w:sz w:val="18"/>
+                <w:szCs w:val="18"/>
+              </w:rPr>
+            </w:pPr>
+            <w:r>
+              <w:rPr>
+                <w:rFonts w:asciiTheme="majorHAnsi" w:eastAsia="Arial" w:hAnsiTheme="majorHAnsi" w:cstheme="majorHAnsi"/>
+                <w:sz w:val="18"/>
+                <w:szCs w:val="18"/>
+              </w:rPr>
+              <w:t>Fiabilidad (recuperabilidad)</w:t>
+            </w:r>
+          </w:p>
+        </w:tc>
+        <w:tc>
+          <w:tcPr>
+            <w:tcW w:w="2560" w:type="dxa"/>
+            <w:tcBorders>
+              <w:top w:val="single" w:sz="4" w:space="0" w:color="A6A6A6"/>
+              <w:left w:val="single" w:sz="4" w:space="0" w:color="A6A6A6"/>
+              <w:bottom w:val="single" w:sz="4" w:space="0" w:color="A6A6A6"/>
+              <w:right w:val="single" w:sz="4" w:space="0" w:color="A6A6A6"/>
+            </w:tcBorders>
+            <w:tcMar>
+              <w:top w:w="60" w:type="dxa"/>
+              <w:left w:w="100" w:type="dxa"/>
+              <w:bottom w:w="60" w:type="dxa"/>
+              <w:right w:w="100" w:type="dxa"/>
+            </w:tcMar>
+          </w:tcPr>
+          <w:p>
+            <w:pPr>
+              <w:spacing w:after="30"/>
+              <w:rPr>
+                <w:rFonts w:asciiTheme="majorHAnsi" w:eastAsia="Arial" w:hAnsiTheme="majorHAnsi" w:cstheme="majorHAnsi"/>
+                <w:sz w:val="18"/>
+                <w:szCs w:val="18"/>
+              </w:rPr>
+            </w:pPr>
+            <w:r>
+              <w:rPr>
+                <w:rFonts w:asciiTheme="majorHAnsi" w:eastAsia="Arial" w:hAnsiTheme="majorHAnsi" w:cstheme="majorHAnsi"/>
+                <w:sz w:val="18"/>
+                <w:szCs w:val="18"/>
+              </w:rPr>
+              <w:t>Al restablecerse la conexión, el sistema deberá sincronizar automáticamente datos, archivos multimedia y registros de auditoría con la base de datos central, sin duplicados.</w:t>
+            </w:r>
+          </w:p>
+        </w:tc>
+        <w:tc>
+          <w:tcPr>
+            <w:tcW w:w="2000" w:type="dxa"/>
+            <w:tcBorders>
+              <w:top w:val="single" w:sz="4" w:space="0" w:color="A6A6A6"/>
+              <w:left w:val="single" w:sz="4" w:space="0" w:color="A6A6A6"/>
+              <w:bottom w:val="single" w:sz="4" w:space="0" w:color="A6A6A6"/>
+              <w:right w:val="single" w:sz="4" w:space="0" w:color="A6A6A6"/>
+            </w:tcBorders>
+            <w:tcMar>
+              <w:top w:w="60" w:type="dxa"/>
+              <w:left w:w="100" w:type="dxa"/>
+              <w:bottom w:w="60" w:type="dxa"/>
+              <w:right w:w="100" w:type="dxa"/>
+            </w:tcMar>
+          </w:tcPr>
+          <w:p>
+            <w:pPr>
+              <w:spacing w:after="30"/>
+              <w:rPr>
+                <w:rFonts w:asciiTheme="majorHAnsi" w:eastAsia="Arial" w:hAnsiTheme="majorHAnsi" w:cstheme="majorHAnsi"/>
+                <w:sz w:val="18"/>
+                <w:szCs w:val="18"/>
+              </w:rPr>
+            </w:pPr>
+            <w:r>
+              <w:rPr>
+                <w:rFonts w:asciiTheme="majorHAnsi" w:eastAsia="Arial" w:hAnsiTheme="majorHAnsi" w:cstheme="majorHAnsi"/>
+                <w:sz w:val="18"/>
+                <w:szCs w:val="18"/>
+              </w:rPr>
+              <w:t>100 % de los registros sincronizados, 0 duplicados y 0 pérdidas; 200 registros con 50 fotografías en máximo 5 min.</w:t>
+            </w:r>
+          </w:p>
+        </w:tc>
+        <w:tc>
+          <w:tcPr>
+            <w:tcW w:w="1900" w:type="dxa"/>
+            <w:tcBorders>
+              <w:top w:val="single" w:sz="4" w:space="0" w:color="A6A6A6"/>
+              <w:left w:val="single" w:sz="4" w:space="0" w:color="A6A6A6"/>
+              <w:bottom w:val="single" w:sz="4" w:space="0" w:color="A6A6A6"/>
+              <w:right w:val="single" w:sz="4" w:space="0" w:color="A6A6A6"/>
+            </w:tcBorders>
+            <w:tcMar>
+              <w:top w:w="60" w:type="dxa"/>
+              <w:left w:w="100" w:type="dxa"/>
+              <w:bottom w:w="60" w:type="dxa"/>
+              <w:right w:w="100" w:type="dxa"/>
+            </w:tcMar>
+          </w:tcPr>
+          <w:p>
+            <w:pPr>
+              <w:spacing w:after="30"/>
+              <w:rPr>
+                <w:rFonts w:asciiTheme="majorHAnsi" w:eastAsia="Arial" w:hAnsiTheme="majorHAnsi" w:cstheme="majorHAnsi"/>
+                <w:sz w:val="18"/>
+                <w:szCs w:val="18"/>
+              </w:rPr>
+            </w:pPr>
+            <w:r>
+              <w:rPr>
+                <w:rFonts w:asciiTheme="majorHAnsi" w:eastAsia="Arial" w:hAnsiTheme="majorHAnsi" w:cstheme="majorHAnsi"/>
+                <w:sz w:val="18"/>
+                <w:szCs w:val="18"/>
+              </w:rPr>
+              <w:t>Crear 200 registros sin conexión, reconectar y comparar conteos y huellas con la base central; repetir 3 veces e interrumpir la conexión a mitad de una sincronización.</w:t>
+            </w:r>
+          </w:p>
+        </w:tc>
+      </w:tr>
+      <w:tr>
+        <w:trPr>
+          <w:cantSplit/>
+        </w:trPr>
+        <w:tc>
+          <w:tcPr>
+            <w:tcW w:w="900" w:type="dxa"/>
+            <w:tcBorders>
+              <w:top w:val="single" w:sz="4" w:space="0" w:color="A6A6A6"/>
+              <w:left w:val="single" w:sz="4" w:space="0" w:color="A6A6A6"/>
+              <w:bottom w:val="single" w:sz="4" w:space="0" w:color="A6A6A6"/>
+              <w:right w:val="single" w:sz="4" w:space="0" w:color="A6A6A6"/>
+            </w:tcBorders>
+            <w:tcMar>
+              <w:top w:w="60" w:type="dxa"/>
+              <w:left w:w="100" w:type="dxa"/>
+              <w:bottom w:w="60" w:type="dxa"/>
+              <w:right w:w="100" w:type="dxa"/>
+            </w:tcMar>
+          </w:tcPr>
+          <w:p>
+            <w:pPr>
+              <w:spacing w:after="30"/>
+              <w:rPr>
+                <w:rFonts w:asciiTheme="majorHAnsi" w:eastAsia="Arial" w:hAnsiTheme="majorHAnsi" w:cstheme="majorHAnsi"/>
+                <w:sz w:val="18"/>
+                <w:szCs w:val="18"/>
+              </w:rPr>
+            </w:pPr>
+            <w:r>
+              <w:rPr>
+                <w:rFonts w:asciiTheme="majorHAnsi" w:eastAsia="Arial" w:hAnsiTheme="majorHAnsi" w:cstheme="majorHAnsi"/>
+                <w:sz w:val="18"/>
+                <w:szCs w:val="18"/>
+              </w:rPr>
+              <w:t>RNF-10</w:t>
+            </w:r>
+          </w:p>
+        </w:tc>
+        <w:tc>
+          <w:tcPr>
+            <w:tcW w:w="2000" w:type="dxa"/>
+            <w:tcBorders>
+              <w:top w:val="single" w:sz="4" w:space="0" w:color="A6A6A6"/>
+              <w:left w:val="single" w:sz="4" w:space="0" w:color="A6A6A6"/>
+              <w:bottom w:val="single" w:sz="4" w:space="0" w:color="A6A6A6"/>
+              <w:right w:val="single" w:sz="4" w:space="0" w:color="A6A6A6"/>
+            </w:tcBorders>
+            <w:tcMar>
+              <w:top w:w="60" w:type="dxa"/>
+              <w:left w:w="100" w:type="dxa"/>
+              <w:bottom w:w="60" w:type="dxa"/>
+              <w:right w:w="100" w:type="dxa"/>
+            </w:tcMar>
+          </w:tcPr>
+          <w:p>
+            <w:pPr>
+              <w:spacing w:after="30"/>
+              <w:rPr>
+                <w:rFonts w:asciiTheme="majorHAnsi" w:eastAsia="Arial" w:hAnsiTheme="majorHAnsi" w:cstheme="majorHAnsi"/>
+                <w:sz w:val="18"/>
+                <w:szCs w:val="18"/>
+              </w:rPr>
+            </w:pPr>
+            <w:r>
+              <w:rPr>
+                <w:rFonts w:asciiTheme="majorHAnsi" w:eastAsia="Arial" w:hAnsiTheme="majorHAnsi" w:cstheme="majorHAnsi"/>
+                <w:sz w:val="18"/>
+                <w:szCs w:val="18"/>
+              </w:rPr>
+              <w:t>Fiabilidad (tolerancia a fallos del cliente)</w:t>
+            </w:r>
+          </w:p>
+        </w:tc>
+        <w:tc>
+          <w:tcPr>
+            <w:tcW w:w="2560" w:type="dxa"/>
+            <w:tcBorders>
+              <w:top w:val="single" w:sz="4" w:space="0" w:color="A6A6A6"/>
+              <w:left w:val="single" w:sz="4" w:space="0" w:color="A6A6A6"/>
+              <w:bottom w:val="single" w:sz="4" w:space="0" w:color="A6A6A6"/>
+              <w:right w:val="single" w:sz="4" w:space="0" w:color="A6A6A6"/>
+            </w:tcBorders>
+            <w:tcMar>
+              <w:top w:w="60" w:type="dxa"/>
+              <w:left w:w="100" w:type="dxa"/>
+              <w:bottom w:w="60" w:type="dxa"/>
+              <w:right w:w="100" w:type="dxa"/>
+            </w:tcMar>
+          </w:tcPr>
+          <w:p>
+            <w:pPr>
+              <w:spacing w:after="30"/>
+              <w:rPr>
+                <w:rFonts w:asciiTheme="majorHAnsi" w:eastAsia="Arial" w:hAnsiTheme="majorHAnsi" w:cstheme="majorHAnsi"/>
+                <w:sz w:val="18"/>
+                <w:szCs w:val="18"/>
+              </w:rPr>
+            </w:pPr>
+            <w:r>
+              <w:rPr>
+                <w:rFonts w:asciiTheme="majorHAnsi" w:eastAsia="Arial" w:hAnsiTheme="majorHAnsi" w:cstheme="majorHAnsi"/>
+                <w:sz w:val="18"/>
+                <w:szCs w:val="18"/>
+              </w:rPr>
+              <w:t>Ante una falla de conectividad durante la consulta de estatus o la autorización 2FA, la interfaz del cliente deberá informar el estado y reintentar automáticamente.</w:t>
+            </w:r>
+          </w:p>
+        </w:tc>
+        <w:tc>
+          <w:tcPr>
+            <w:tcW w:w="2000" w:type="dxa"/>
+            <w:tcBorders>
+              <w:top w:val="single" w:sz="4" w:space="0" w:color="A6A6A6"/>
+              <w:left w:val="single" w:sz="4" w:space="0" w:color="A6A6A6"/>
+              <w:bottom w:val="single" w:sz="4" w:space="0" w:color="A6A6A6"/>
+              <w:right w:val="single" w:sz="4" w:space="0" w:color="A6A6A6"/>
+            </w:tcBorders>
+            <w:tcMar>
+              <w:top w:w="60" w:type="dxa"/>
+              <w:left w:w="100" w:type="dxa"/>
+              <w:bottom w:w="60" w:type="dxa"/>
+              <w:right w:w="100" w:type="dxa"/>
+            </w:tcMar>
+          </w:tcPr>
+          <w:p>
+            <w:pPr>
+              <w:spacing w:after="30"/>
+              <w:rPr>
+                <w:rFonts w:asciiTheme="majorHAnsi" w:eastAsia="Arial" w:hAnsiTheme="majorHAnsi" w:cstheme="majorHAnsi"/>
+                <w:sz w:val="18"/>
+                <w:szCs w:val="18"/>
+              </w:rPr>
+            </w:pPr>
+            <w:r>
+              <w:rPr>
+                <w:rFonts w:asciiTheme="majorHAnsi" w:eastAsia="Arial" w:hAnsiTheme="majorHAnsi" w:cstheme="majorHAnsi"/>
+                <w:sz w:val="18"/>
+                <w:szCs w:val="18"/>
+              </w:rPr>
+              <w:t>Mensaje de estado en máximo 3 s; reintento automático cada 30 s o menos hasta completar; 0 autorizaciones duplicadas o perdidas.</w:t>
+            </w:r>
+          </w:p>
+        </w:tc>
+        <w:tc>
+          <w:tcPr>
+            <w:tcW w:w="1900" w:type="dxa"/>
+            <w:tcBorders>
+              <w:top w:val="single" w:sz="4" w:space="0" w:color="A6A6A6"/>
+              <w:left w:val="single" w:sz="4" w:space="0" w:color="A6A6A6"/>
+              <w:bottom w:val="single" w:sz="4" w:space="0" w:color="A6A6A6"/>
+              <w:right w:val="single" w:sz="4" w:space="0" w:color="A6A6A6"/>
+            </w:tcBorders>
+            <w:tcMar>
+              <w:top w:w="60" w:type="dxa"/>
+              <w:left w:w="100" w:type="dxa"/>
+              <w:bottom w:w="60" w:type="dxa"/>
+              <w:right w:w="100" w:type="dxa"/>
+            </w:tcMar>
+          </w:tcPr>
+          <w:p>
+            <w:pPr>
+              <w:spacing w:after="30"/>
+              <w:rPr>
+                <w:rFonts w:asciiTheme="majorHAnsi" w:eastAsia="Arial" w:hAnsiTheme="majorHAnsi" w:cstheme="majorHAnsi"/>
+                <w:sz w:val="18"/>
+                <w:szCs w:val="18"/>
+              </w:rPr>
+            </w:pPr>
+            <w:r>
+              <w:rPr>
+                <w:rFonts w:asciiTheme="majorHAnsi" w:eastAsia="Arial" w:hAnsiTheme="majorHAnsi" w:cstheme="majorHAnsi"/>
+                <w:sz w:val="18"/>
+                <w:szCs w:val="18"/>
+              </w:rPr>
+              <w:t>Cortar el servidor durante la consulta y durante el envío del código, cronometrar el mensaje y revisar la base de datos tras restablecer el servicio.</w:t>
+            </w:r>
           </w:p>
         </w:tc>
       </w:tr>
@@ -18305,6 +19844,7 @@
         <w:pStyle w:val="Ttulo2"/>
       </w:pPr>
       <w:r>
+        <w:lastRenderedPageBreak/>
         <w:t>4.8 Requisitos de protección de datos personales</w:t>
       </w:r>
     </w:p>
@@ -18862,7 +20402,6 @@
                 <w:sz w:val="18"/>
                 <w:szCs w:val="18"/>
               </w:rPr>
-              <w:lastRenderedPageBreak/>
               <w:t>Flujo principal</w:t>
             </w:r>
           </w:p>
@@ -19396,6 +20935,7 @@
                 <w:sz w:val="19"/>
                 <w:szCs w:val="19"/>
               </w:rPr>
+              <w:lastRenderedPageBreak/>
               <w:t>Fecha</w:t>
             </w:r>
           </w:p>
@@ -33155,6 +34695,7 @@
   <w:style w:type="character" w:default="1" w:styleId="Fuentedeprrafopredeter">
     <w:name w:val="Default Paragraph Font"/>
     <w:uiPriority w:val="1"/>
+    <w:semiHidden/>
     <w:unhideWhenUsed/>
   </w:style>
   <w:style w:type="table" w:default="1" w:styleId="Tablanormal">

</xml_diff>